<commit_message>
Curriculo Fase 5: Conversacional 2 (A2.2, enero 2027) completo
- 8 semanas: guias del profesor (S01-S08) y material del alumno, cada una con revision de coreano nativo y pedagogica, mas control de continuidad (diseno v1.1, seccion J)
- Guia_Profesor_Conversacional2_Enero_2027 (460 pags) y Cuaderno_Alumno_Conversacional2_Enero_2027 (175 pags), docx + pdf
- md_a_docx.js: nueva clave conversacional2
- Pagina publica, indice, WhatsApp y folleto con el nuevo orden de semanas (opcion A, por confirmar)
- Clip nuevo de 비슷하다; CLAUDE.md: Fase 5 hecha y hoja resumen

Co-Authored-By: Claude Opus 5.5 <noreply@anthropic.com>
</commit_message>
<xml_diff>
--- a/Curriculo/publico/Folleto_Cursos_Octubre_2026.docx
+++ b/Curriculo/publico/Folleto_Cursos_Octubre_2026.docx
@@ -316,7 +316,7 @@
           <w:sz w:val="16"/>
           <w:szCs w:val="16"/>
         </w:rPr>
-        <w:t xml:space="preserve">Horarios en hora de Chile (Santiago, UTC−3 durante todo el curso). Versión del 26 de septiembre de 2026.</w:t>
+        <w:t xml:space="preserve">Horarios en hora de Chile (Santiago, UTC−3 durante todo el curso). Versión del 29 de septiembre de 2026.</w:t>
       </w:r>
     </w:p>
     <w:p>
@@ -4197,7 +4197,7 @@
                 <w:sz w:val="16"/>
                 <w:szCs w:val="16"/>
               </w:rPr>
-              <w:t xml:space="preserve">Comparar, opinar y narrar sobre escuela, trabajo, fiestas, leyendas y K-drama</w:t>
+              <w:t xml:space="preserve">Explicar y comparar escuela, 수능, oficina, 설날 y 추석, leyendas y K-drama</w:t>
             </w:r>
           </w:p>
         </w:tc>
@@ -4280,7 +4280,7 @@
                 <w:sz w:val="16"/>
                 <w:szCs w:val="16"/>
               </w:rPr>
-              <w:t xml:space="preserve">Por anunciar</w:t>
+              <w:t xml:space="preserve">US$150 · o 2 × US$75</w:t>
             </w:r>
           </w:p>
         </w:tc>
@@ -14616,7 +14616,7 @@
           <w:sz w:val="20"/>
           <w:szCs w:val="20"/>
         </w:rPr>
-        <w:t xml:space="preserve">Es el paso que sigue a Conversacional 1. Ya no se trata solo de qué te gusta de Corea, sino de cómo se vive: en la sala de clases, en la oficina, en las fiestas familiares y en las historias que los coreanos escuchan desde niños. Vas a comparar, opinar y narrar en coreano, con frases sencillas y bien conectadas.</w:t>
+        <w:t xml:space="preserve">Es el paso que sigue a Conversacional 1. Ya no se trata solo de qué te gusta de Corea, sino de cómo se vive: en la sala de clases y el día del 수능, en la oficina, en el 설날 y el 추석, en los cuentos del tigre y en los K-dramas. Vas a explicar, comparar, opinar y contar historias en coreano, con frases sencillas y bien conectadas, y a hablar con el respeto que corresponde a un jefe o a una persona mayor. Hay dos laboratorios de conversación y cierras con un mini-pódcast de 3 minutos sobre el tema que elijas.</w:t>
       </w:r>
     </w:p>
     <w:tbl>
@@ -14751,7 +14751,7 @@
                 <w:sz w:val="18"/>
                 <w:szCs w:val="18"/>
               </w:rPr>
-              <w:t xml:space="preserve">5 · 설날 · Año Nuevo lunar</w:t>
+              <w:t xml:space="preserve">5 · 설날 y 추석 · 설날과 추석</w:t>
             </w:r>
           </w:p>
         </w:tc>
@@ -14810,7 +14810,7 @@
                 <w:sz w:val="18"/>
                 <w:szCs w:val="18"/>
               </w:rPr>
-              <w:t xml:space="preserve">6 · 추석 · Fiesta de la cosecha</w:t>
+              <w:t xml:space="preserve">6 · Mitos y leyendas · 옛날 옛적에</w:t>
             </w:r>
           </w:p>
         </w:tc>
@@ -14899,7 +14899,7 @@
                 <w:sz w:val="18"/>
                 <w:szCs w:val="18"/>
               </w:rPr>
-              <w:t xml:space="preserve">4 · Mitos y leyendas · 옛날 옛적에</w:t>
+              <w:t xml:space="preserve">4 · Laboratorio de conversación 3 · se viene el 설날</w:t>
             </w:r>
           </w:p>
         </w:tc>
@@ -14926,7 +14926,7 @@
                 <w:sz w:val="18"/>
                 <w:szCs w:val="18"/>
               </w:rPr>
-              <w:t xml:space="preserve">8 · Proyecto final</w:t>
+              <w:t xml:space="preserve">8 · Laboratorio de conversación 4 y proyecto final</w:t>
             </w:r>
           </w:p>
         </w:tc>
@@ -15017,7 +15017,7 @@
                 <w:sz w:val="18"/>
                 <w:szCs w:val="18"/>
               </w:rPr>
-              <w:t xml:space="preserve">8 semanas · 1 clase en vivo de 60 minutos por semana · Zoom.</w:t>
+              <w:t xml:space="preserve">8 semanas · 1 clase en vivo de 60 minutos por semana, dos de ellas laboratorios de conversación · Zoom · la clase es casi toda en coreano.</w:t>
             </w:r>
           </w:p>
         </w:tc>
@@ -15051,7 +15051,7 @@
                 <w:sz w:val="18"/>
                 <w:szCs w:val="18"/>
               </w:rPr>
-              <w:t xml:space="preserve">Por anunciar</w:t>
+              <w:t xml:space="preserve">Inversión</w:t>
             </w:r>
           </w:p>
         </w:tc>
@@ -15073,11 +15073,73 @@
             <w:r>
               <w:rPr>
                 <w:rFonts w:ascii="Arial" w:cs="Arial" w:eastAsia="Malgun Gothic" w:hAnsi="Arial"/>
-                <w:color w:val="1B1C24"/>
-                <w:sz w:val="18"/>
-                <w:szCs w:val="18"/>
-              </w:rPr>
-              <w:t xml:space="preserve">Día, hora, profesor/a, fecha de inicio y precio de la cohorte de enero 2027.</w:t>
+                <w:b/>
+                <w:bCs/>
+                <w:color w:val="4236F6"/>
+                <w:sz w:val="18"/>
+                <w:szCs w:val="18"/>
+              </w:rPr>
+              <w:t xml:space="preserve">US$150 el curso completo · o 2 cuotas de US$75</w:t>
+            </w:r>
+          </w:p>
+        </w:tc>
+      </w:tr>
+      <w:tr>
+        <w:trPr>
+          <w:cantSplit/>
+        </w:trPr>
+        <w:tc>
+          <w:tcPr>
+            <w:tcW w:type="dxa" w:w="1750"/>
+            <w:shd w:fill="EEF1F6" w:val="clear"/>
+            <w:tcMar>
+              <w:top w:type="dxa" w:w="35"/>
+              <w:left w:type="dxa" w:w="90"/>
+              <w:bottom w:type="dxa" w:w="35"/>
+              <w:right w:type="dxa" w:w="90"/>
+            </w:tcMar>
+            <w:vAlign w:val="center"/>
+          </w:tcPr>
+          <w:p>
+            <w:pPr>
+              <w:spacing w:after="0" w:line="240"/>
+            </w:pPr>
+            <w:r>
+              <w:rPr>
+                <w:rFonts w:ascii="Arial" w:cs="Arial" w:eastAsia="Malgun Gothic" w:hAnsi="Arial"/>
+                <w:b/>
+                <w:bCs/>
+                <w:color w:val="003478"/>
+                <w:sz w:val="18"/>
+                <w:szCs w:val="18"/>
+              </w:rPr>
+              <w:t xml:space="preserve">Por confirmar</w:t>
+            </w:r>
+          </w:p>
+        </w:tc>
+        <w:tc>
+          <w:tcPr>
+            <w:tcW w:type="dxa" w:w="8330"/>
+            <w:tcMar>
+              <w:top w:type="dxa" w:w="35"/>
+              <w:left w:type="dxa" w:w="90"/>
+              <w:bottom w:type="dxa" w:w="35"/>
+              <w:right w:type="dxa" w:w="90"/>
+            </w:tcMar>
+            <w:vAlign w:val="center"/>
+          </w:tcPr>
+          <w:p>
+            <w:pPr>
+              <w:spacing w:after="0" w:line="240"/>
+            </w:pPr>
+            <w:r>
+              <w:rPr>
+                <w:rFonts w:ascii="Arial" w:cs="Arial" w:eastAsia="Malgun Gothic" w:hAnsi="Arial"/>
+                <w:color w:val="1B1C24"/>
+                <w:sz w:val="18"/>
+                <w:szCs w:val="18"/>
+              </w:rPr>
+              <w:t xml:space="preserve">Día, hora, profesor/a y fecha exacta de inicio: confirmar con Academia Seúl.</w:t>
             </w:r>
           </w:p>
         </w:tc>

</xml_diff>

<commit_message>
Materiales corridos una semana: guias, cuadernos, kits, programas, Brevo y decks
Todas las clases de adultos empiezan la semana del 19 de octubre (matricula
hasta el domingo 18). Ninos no cambia (lun 19 al lun 7 dic).

- Guias del profesor y cuadernos de Basico 1, Basico 2, Conversacional 1 y
  TOPIK II con fechas +7 dias, ganchos culturales revisados (Pepero Day,
  suneung, Halloween, cambios de hora) y PDF exportados de nuevo.
- Kits de Kiran y Abby v1.2, guias de alumnos y familias, folleto, hoja
  resumen, 6 programas y Programa Completo v1.2 ES/EN (PDF del sitio).
- Correos de Brevo: E5 dom 18, O1 lun 19, R1a-R1f antes de cada clase 1,
  N1 mar 20; preview.js avisa si un correo trae fechas viejas.
- Specs y 16 decks de Basico 1 y 2 regenerados; filas incompletas centradas.
- Destacado INSCRIBETE y cierre del reel de Kiran con domingo 18.
- Mar 8 dic (feriado en Chile) queda "por confirmar" en todo.

Co-Authored-By: Claude Opus 5.5 <noreply@anthropic.com>
</commit_message>
<xml_diff>
--- a/Curriculo/publico/Folleto_Cursos_Octubre_2026.docx
+++ b/Curriculo/publico/Folleto_Cursos_Octubre_2026.docx
@@ -173,7 +173,7 @@
                 <w:sz w:val="21"/>
                 <w:szCs w:val="21"/>
               </w:rPr>
-              <w:t xml:space="preserve">Inicio: semana del 12 de octubre de 2026 · Coreano para Niños: lunes 19 de octubre</w:t>
+              <w:t xml:space="preserve">Inicio: semana del 19 de octubre de 2026 (Coreano para Niños: lunes 19) · fin: semana del 7 de diciembre</w:t>
             </w:r>
           </w:p>
           <w:p>
@@ -203,7 +203,7 @@
                 <w:sz w:val="21"/>
                 <w:szCs w:val="21"/>
               </w:rPr>
-              <w:t xml:space="preserve">Matrícula abierta hasta el domingo 11 de octubre (o hasta llenar los cupos)</w:t>
+              <w:t xml:space="preserve">Matrícula abierta hasta el domingo 18 de octubre (o hasta llenar los cupos)</w:t>
             </w:r>
           </w:p>
         </w:tc>
@@ -316,7 +316,7 @@
           <w:sz w:val="16"/>
           <w:szCs w:val="16"/>
         </w:rPr>
-        <w:t xml:space="preserve">Horarios en hora de Chile (Santiago, UTC−3 durante todo el curso). Versión del 29 de septiembre de 2026.</w:t>
+        <w:t xml:space="preserve">Horarios en hora de Chile (Santiago, UTC−3 durante todo el curso). Versión del 16 de octubre de 2026.</w:t>
       </w:r>
     </w:p>
     <w:p>
@@ -807,7 +807,7 @@
                 <w:sz w:val="16"/>
                 <w:szCs w:val="16"/>
               </w:rPr>
-              <w:t xml:space="preserve">Kiran · desde el 13 oct</w:t>
+              <w:t xml:space="preserve">Kiran · desde el 20 oct</w:t>
             </w:r>
           </w:p>
         </w:tc>
@@ -877,7 +877,7 @@
                 <w:sz w:val="16"/>
                 <w:szCs w:val="16"/>
               </w:rPr>
-              <w:t xml:space="preserve">Kiran · desde el 15 oct</w:t>
+              <w:t xml:space="preserve">Kiran · desde el 22 oct</w:t>
             </w:r>
           </w:p>
         </w:tc>
@@ -978,7 +978,7 @@
                 <w:sz w:val="16"/>
                 <w:szCs w:val="16"/>
               </w:rPr>
-              <w:t xml:space="preserve">Abby · desde el 13 oct</w:t>
+              <w:t xml:space="preserve">Abby · desde el 20 oct</w:t>
             </w:r>
           </w:p>
         </w:tc>
@@ -1020,7 +1020,7 @@
                 <w:sz w:val="16"/>
                 <w:szCs w:val="16"/>
               </w:rPr>
-              <w:t xml:space="preserve">Jay · desde el 14 oct</w:t>
+              <w:t xml:space="preserve">Jay · desde el 21 oct</w:t>
             </w:r>
           </w:p>
         </w:tc>
@@ -1062,7 +1062,7 @@
                 <w:sz w:val="16"/>
                 <w:szCs w:val="16"/>
               </w:rPr>
-              <w:t xml:space="preserve">Jay · desde el 15 oct</w:t>
+              <w:t xml:space="preserve">Jay · desde el 22 oct</w:t>
             </w:r>
           </w:p>
         </w:tc>
@@ -1377,7 +1377,7 @@
                 <w:sz w:val="18"/>
                 <w:szCs w:val="18"/>
               </w:rPr>
-              <w:t xml:space="preserve">Martes 13 de octubre</w:t>
+              <w:t xml:space="preserve">Martes 20 de octubre</w:t>
             </w:r>
           </w:p>
         </w:tc>
@@ -1403,7 +1403,7 @@
                 <w:sz w:val="18"/>
                 <w:szCs w:val="18"/>
               </w:rPr>
-              <w:t xml:space="preserve">Martes 1 de diciembre</w:t>
+              <w:t xml:space="preserve">Martes 8 de diciembre *</w:t>
             </w:r>
           </w:p>
         </w:tc>
@@ -1534,7 +1534,7 @@
                 <w:sz w:val="18"/>
                 <w:szCs w:val="18"/>
               </w:rPr>
-              <w:t xml:space="preserve">Jueves 15 de octubre</w:t>
+              <w:t xml:space="preserve">Jueves 22 de octubre</w:t>
             </w:r>
           </w:p>
         </w:tc>
@@ -1561,7 +1561,7 @@
                 <w:sz w:val="18"/>
                 <w:szCs w:val="18"/>
               </w:rPr>
-              <w:t xml:space="preserve">Jueves 3 de diciembre</w:t>
+              <w:t xml:space="preserve">Jueves 10 de diciembre</w:t>
             </w:r>
           </w:p>
         </w:tc>
@@ -1674,7 +1674,7 @@
                 <w:sz w:val="18"/>
                 <w:szCs w:val="18"/>
               </w:rPr>
-              <w:t xml:space="preserve">Miércoles 14 de octubre</w:t>
+              <w:t xml:space="preserve">Miércoles 21 de octubre</w:t>
             </w:r>
           </w:p>
         </w:tc>
@@ -1700,7 +1700,7 @@
                 <w:sz w:val="18"/>
                 <w:szCs w:val="18"/>
               </w:rPr>
-              <w:t xml:space="preserve">Miércoles 2 de diciembre</w:t>
+              <w:t xml:space="preserve">Miércoles 9 de diciembre</w:t>
             </w:r>
           </w:p>
         </w:tc>
@@ -1817,7 +1817,7 @@
                 <w:sz w:val="18"/>
                 <w:szCs w:val="18"/>
               </w:rPr>
-              <w:t xml:space="preserve">Martes 13 de octubre</w:t>
+              <w:t xml:space="preserve">Martes 20 de octubre</w:t>
             </w:r>
           </w:p>
         </w:tc>
@@ -1844,7 +1844,7 @@
                 <w:sz w:val="18"/>
                 <w:szCs w:val="18"/>
               </w:rPr>
-              <w:t xml:space="preserve">Martes 1 de diciembre</w:t>
+              <w:t xml:space="preserve">Martes 8 de diciembre *</w:t>
             </w:r>
           </w:p>
         </w:tc>
@@ -1957,7 +1957,7 @@
                 <w:sz w:val="18"/>
                 <w:szCs w:val="18"/>
               </w:rPr>
-              <w:t xml:space="preserve">Jueves 15 de octubre</w:t>
+              <w:t xml:space="preserve">Jueves 22 de octubre</w:t>
             </w:r>
           </w:p>
         </w:tc>
@@ -1983,7 +1983,7 @@
                 <w:sz w:val="18"/>
                 <w:szCs w:val="18"/>
               </w:rPr>
-              <w:t xml:space="preserve">Jueves 3 de diciembre</w:t>
+              <w:t xml:space="preserve">Jueves 10 de diciembre</w:t>
             </w:r>
           </w:p>
         </w:tc>
@@ -2100,7 +2100,7 @@
                 <w:sz w:val="18"/>
                 <w:szCs w:val="18"/>
               </w:rPr>
-              <w:t xml:space="preserve">Lunes 19 de octubre *</w:t>
+              <w:t xml:space="preserve">Lunes 19 de octubre</w:t>
             </w:r>
           </w:p>
         </w:tc>
@@ -2297,7 +2297,7 @@
           <w:sz w:val="17"/>
           <w:szCs w:val="17"/>
         </w:rPr>
-        <w:t xml:space="preserve">* El lunes 12 de octubre es feriado en Chile: por eso Coreano para Niños empieza el 19 y termina una semana después que los cursos de adultos. Básico 1 tiene dos secciones con el mismo programa y la misma profesora. La matrícula de todos los cursos cierra el domingo 11 de octubre.</w:t>
+        <w:t xml:space="preserve">* El martes 8 de diciembre es feriado en Chile: la fecha de la última clase de los martes está por confirmar y la avisamos con tiempo. Todos los cursos parten la semana del 19 de octubre. Básico 1 tiene dos secciones con el mismo programa y la misma profesora. La matrícula de todos los cursos cierra el domingo 18 de octubre.</w:t>
       </w:r>
     </w:p>
     <w:p>
@@ -4909,7 +4909,7 @@
                 <w:sz w:val="18"/>
                 <w:szCs w:val="18"/>
               </w:rPr>
-              <w:t xml:space="preserve">Martes o jueves 20:00 · desde el 13 o el 15 oct</w:t>
+              <w:t xml:space="preserve">Martes o jueves 20:00 · desde el 20 o el 22 oct</w:t>
             </w:r>
           </w:p>
         </w:tc>
@@ -5082,7 +5082,7 @@
                 <w:sz w:val="18"/>
                 <w:szCs w:val="18"/>
               </w:rPr>
-              <w:t xml:space="preserve">Miércoles 21:00 · desde el 14 oct</w:t>
+              <w:t xml:space="preserve">Miércoles 21:00 · desde el 21 oct</w:t>
             </w:r>
           </w:p>
         </w:tc>
@@ -5269,7 +5269,7 @@
                 <w:sz w:val="18"/>
                 <w:szCs w:val="18"/>
               </w:rPr>
-              <w:t xml:space="preserve">Martes 21:00 · desde el 13 oct</w:t>
+              <w:t xml:space="preserve">Martes 21:00 · desde el 20 oct</w:t>
             </w:r>
           </w:p>
         </w:tc>
@@ -5442,7 +5442,7 @@
                 <w:sz w:val="18"/>
                 <w:szCs w:val="18"/>
               </w:rPr>
-              <w:t xml:space="preserve">Jueves 21:00 · desde el 15 oct</w:t>
+              <w:t xml:space="preserve">Jueves 21:00 · desde el 22 oct</w:t>
             </w:r>
           </w:p>
         </w:tc>
@@ -6063,7 +6063,7 @@
                 <w:sz w:val="17"/>
                 <w:szCs w:val="17"/>
               </w:rPr>
-              <w:t xml:space="preserve">13 y 15 oct</w:t>
+              <w:t xml:space="preserve">20 y 22 oct</w:t>
             </w:r>
           </w:p>
         </w:tc>
@@ -6178,7 +6178,7 @@
                 <w:sz w:val="17"/>
                 <w:szCs w:val="17"/>
               </w:rPr>
-              <w:t xml:space="preserve">20 y 22 oct</w:t>
+              <w:t xml:space="preserve">27 y 29 oct</w:t>
             </w:r>
           </w:p>
         </w:tc>
@@ -6293,7 +6293,7 @@
                 <w:sz w:val="17"/>
                 <w:szCs w:val="17"/>
               </w:rPr>
-              <w:t xml:space="preserve">27 y 29 oct</w:t>
+              <w:t xml:space="preserve">3 y 5 nov</w:t>
             </w:r>
           </w:p>
         </w:tc>
@@ -6408,7 +6408,7 @@
                 <w:sz w:val="17"/>
                 <w:szCs w:val="17"/>
               </w:rPr>
-              <w:t xml:space="preserve">3 y 5 nov</w:t>
+              <w:t xml:space="preserve">10 y 12 nov</w:t>
             </w:r>
           </w:p>
         </w:tc>
@@ -6523,7 +6523,7 @@
                 <w:sz w:val="17"/>
                 <w:szCs w:val="17"/>
               </w:rPr>
-              <w:t xml:space="preserve">10 y 12 nov</w:t>
+              <w:t xml:space="preserve">17 y 19 nov</w:t>
             </w:r>
           </w:p>
         </w:tc>
@@ -6638,7 +6638,7 @@
                 <w:sz w:val="17"/>
                 <w:szCs w:val="17"/>
               </w:rPr>
-              <w:t xml:space="preserve">17 y 19 nov</w:t>
+              <w:t xml:space="preserve">24 y 26 nov</w:t>
             </w:r>
           </w:p>
         </w:tc>
@@ -6753,7 +6753,7 @@
                 <w:sz w:val="17"/>
                 <w:szCs w:val="17"/>
               </w:rPr>
-              <w:t xml:space="preserve">24 y 26 nov</w:t>
+              <w:t xml:space="preserve">1 y 3 dic</w:t>
             </w:r>
           </w:p>
         </w:tc>
@@ -6868,7 +6868,7 @@
                 <w:sz w:val="17"/>
                 <w:szCs w:val="17"/>
               </w:rPr>
-              <w:t xml:space="preserve">1 y 3 dic</w:t>
+              <w:t xml:space="preserve">8 (por confirmar) y 10 dic</w:t>
             </w:r>
           </w:p>
         </w:tc>
@@ -7154,7 +7154,7 @@
                 <w:sz w:val="18"/>
                 <w:szCs w:val="18"/>
               </w:rPr>
-              <w:t xml:space="preserve">Martes 20:00–21:00 (13 oct → 1 dic) o jueves 20:00–21:00 (15 oct → 3 dic), hora de Chile · con Kiran (기란). Mismo programa: eliges una sección.</w:t>
+              <w:t xml:space="preserve">Martes 20:00–21:00 (20 oct → 8 dic, por confirmar: es feriado en Chile) o jueves 20:00–21:00 (22 oct → 10 dic), hora de Chile · con Kiran (기란). Mismo programa: eliges una sección.</w:t>
             </w:r>
           </w:p>
         </w:tc>
@@ -7225,7 +7225,7 @@
                 <w:sz w:val="18"/>
                 <w:szCs w:val="18"/>
               </w:rPr>
-              <w:t xml:space="preserve"> (la 2.ª antes de la clase 5: martes 10 o jueves 12 de noviembre).</w:t>
+              <w:t xml:space="preserve"> (la 2.ª antes de la clase 5: martes 17 o jueves 19 de noviembre).</w:t>
             </w:r>
           </w:p>
         </w:tc>
@@ -7829,7 +7829,7 @@
                 <w:sz w:val="17"/>
                 <w:szCs w:val="17"/>
               </w:rPr>
-              <w:t xml:space="preserve">14 oct</w:t>
+              <w:t xml:space="preserve">21 oct</w:t>
             </w:r>
           </w:p>
         </w:tc>
@@ -7944,7 +7944,7 @@
                 <w:sz w:val="17"/>
                 <w:szCs w:val="17"/>
               </w:rPr>
-              <w:t xml:space="preserve">21 oct</w:t>
+              <w:t xml:space="preserve">28 oct</w:t>
             </w:r>
           </w:p>
         </w:tc>
@@ -8059,7 +8059,7 @@
                 <w:sz w:val="17"/>
                 <w:szCs w:val="17"/>
               </w:rPr>
-              <w:t xml:space="preserve">28 oct</w:t>
+              <w:t xml:space="preserve">4 nov</w:t>
             </w:r>
           </w:p>
         </w:tc>
@@ -8174,7 +8174,7 @@
                 <w:sz w:val="17"/>
                 <w:szCs w:val="17"/>
               </w:rPr>
-              <w:t xml:space="preserve">4 nov</w:t>
+              <w:t xml:space="preserve">11 nov</w:t>
             </w:r>
           </w:p>
         </w:tc>
@@ -8289,7 +8289,7 @@
                 <w:sz w:val="17"/>
                 <w:szCs w:val="17"/>
               </w:rPr>
-              <w:t xml:space="preserve">11 nov</w:t>
+              <w:t xml:space="preserve">18 nov</w:t>
             </w:r>
           </w:p>
         </w:tc>
@@ -8404,7 +8404,7 @@
                 <w:sz w:val="17"/>
                 <w:szCs w:val="17"/>
               </w:rPr>
-              <w:t xml:space="preserve">18 nov</w:t>
+              <w:t xml:space="preserve">25 nov</w:t>
             </w:r>
           </w:p>
         </w:tc>
@@ -8519,7 +8519,7 @@
                 <w:sz w:val="17"/>
                 <w:szCs w:val="17"/>
               </w:rPr>
-              <w:t xml:space="preserve">25 nov</w:t>
+              <w:t xml:space="preserve">2 dic</w:t>
             </w:r>
           </w:p>
         </w:tc>
@@ -8634,7 +8634,7 @@
                 <w:sz w:val="17"/>
                 <w:szCs w:val="17"/>
               </w:rPr>
-              <w:t xml:space="preserve">2 dic</w:t>
+              <w:t xml:space="preserve">9 dic</w:t>
             </w:r>
           </w:p>
         </w:tc>
@@ -8929,7 +8929,7 @@
                 <w:sz w:val="18"/>
                 <w:szCs w:val="18"/>
               </w:rPr>
-              <w:t xml:space="preserve">Miércoles 21:00–22:00, hora de Chile (14 oct → 2 dic) · con Jay Kim (김재희).</w:t>
+              <w:t xml:space="preserve">Miércoles 21:00–22:00, hora de Chile (21 oct → 9 dic) · con Jay Kim (김재희).</w:t>
             </w:r>
           </w:p>
         </w:tc>
@@ -9000,7 +9000,7 @@
                 <w:sz w:val="18"/>
                 <w:szCs w:val="18"/>
               </w:rPr>
-              <w:t xml:space="preserve"> (la 2.ª antes de la clase 5: miércoles 11 de noviembre).</w:t>
+              <w:t xml:space="preserve"> (la 2.ª antes de la clase 5: miércoles 18 de noviembre).</w:t>
             </w:r>
           </w:p>
         </w:tc>
@@ -9604,7 +9604,7 @@
                 <w:sz w:val="17"/>
                 <w:szCs w:val="17"/>
               </w:rPr>
-              <w:t xml:space="preserve">13 oct</w:t>
+              <w:t xml:space="preserve">20 oct</w:t>
             </w:r>
           </w:p>
         </w:tc>
@@ -9719,7 +9719,7 @@
                 <w:sz w:val="17"/>
                 <w:szCs w:val="17"/>
               </w:rPr>
-              <w:t xml:space="preserve">20 oct</w:t>
+              <w:t xml:space="preserve">27 oct</w:t>
             </w:r>
           </w:p>
         </w:tc>
@@ -9834,7 +9834,7 @@
                 <w:sz w:val="17"/>
                 <w:szCs w:val="17"/>
               </w:rPr>
-              <w:t xml:space="preserve">27 oct</w:t>
+              <w:t xml:space="preserve">3 nov</w:t>
             </w:r>
           </w:p>
         </w:tc>
@@ -9949,7 +9949,7 @@
                 <w:sz w:val="17"/>
                 <w:szCs w:val="17"/>
               </w:rPr>
-              <w:t xml:space="preserve">3 nov</w:t>
+              <w:t xml:space="preserve">10 nov</w:t>
             </w:r>
           </w:p>
         </w:tc>
@@ -10064,7 +10064,7 @@
                 <w:sz w:val="17"/>
                 <w:szCs w:val="17"/>
               </w:rPr>
-              <w:t xml:space="preserve">10 nov</w:t>
+              <w:t xml:space="preserve">17 nov</w:t>
             </w:r>
           </w:p>
         </w:tc>
@@ -10179,7 +10179,7 @@
                 <w:sz w:val="17"/>
                 <w:szCs w:val="17"/>
               </w:rPr>
-              <w:t xml:space="preserve">17 nov</w:t>
+              <w:t xml:space="preserve">24 nov</w:t>
             </w:r>
           </w:p>
         </w:tc>
@@ -10294,7 +10294,7 @@
                 <w:sz w:val="17"/>
                 <w:szCs w:val="17"/>
               </w:rPr>
-              <w:t xml:space="preserve">24 nov</w:t>
+              <w:t xml:space="preserve">1 dic</w:t>
             </w:r>
           </w:p>
         </w:tc>
@@ -10409,7 +10409,7 @@
                 <w:sz w:val="17"/>
                 <w:szCs w:val="17"/>
               </w:rPr>
-              <w:t xml:space="preserve">1 dic</w:t>
+              <w:t xml:space="preserve">8 dic (por confirmar)</w:t>
             </w:r>
           </w:p>
         </w:tc>
@@ -10713,7 +10713,7 @@
                 <w:sz w:val="18"/>
                 <w:szCs w:val="18"/>
               </w:rPr>
-              <w:t xml:space="preserve">Martes 21:00–22:00, hora de Chile (13 oct → 1 dic) = miércoles 09:00 en Corea · con Abby (홍미영), profesora coreana nativa que enseña desde Corea.</w:t>
+              <w:t xml:space="preserve">Martes 21:00–22:00, hora de Chile (20 oct → 8 dic, por confirmar: es feriado en Chile) = miércoles 09:00 en Corea · con Abby (홍미영), profesora coreana nativa que enseña desde Corea.</w:t>
             </w:r>
           </w:p>
         </w:tc>
@@ -10784,7 +10784,7 @@
                 <w:sz w:val="18"/>
                 <w:szCs w:val="18"/>
               </w:rPr>
-              <w:t xml:space="preserve"> (la 2.ª antes de la clase 5: martes 10 de noviembre).</w:t>
+              <w:t xml:space="preserve"> (la 2.ª antes de la clase 5: martes 17 de noviembre).</w:t>
             </w:r>
           </w:p>
         </w:tc>
@@ -11388,7 +11388,7 @@
                 <w:sz w:val="17"/>
                 <w:szCs w:val="17"/>
               </w:rPr>
-              <w:t xml:space="preserve">15 oct</w:t>
+              <w:t xml:space="preserve">22 oct</w:t>
             </w:r>
           </w:p>
         </w:tc>
@@ -11503,7 +11503,7 @@
                 <w:sz w:val="17"/>
                 <w:szCs w:val="17"/>
               </w:rPr>
-              <w:t xml:space="preserve">22 oct</w:t>
+              <w:t xml:space="preserve">29 oct</w:t>
             </w:r>
           </w:p>
         </w:tc>
@@ -11618,7 +11618,7 @@
                 <w:sz w:val="17"/>
                 <w:szCs w:val="17"/>
               </w:rPr>
-              <w:t xml:space="preserve">29 oct</w:t>
+              <w:t xml:space="preserve">5 nov</w:t>
             </w:r>
           </w:p>
         </w:tc>
@@ -11733,7 +11733,7 @@
                 <w:sz w:val="17"/>
                 <w:szCs w:val="17"/>
               </w:rPr>
-              <w:t xml:space="preserve">5 nov</w:t>
+              <w:t xml:space="preserve">12 nov</w:t>
             </w:r>
           </w:p>
         </w:tc>
@@ -11848,7 +11848,7 @@
                 <w:sz w:val="17"/>
                 <w:szCs w:val="17"/>
               </w:rPr>
-              <w:t xml:space="preserve">12 nov</w:t>
+              <w:t xml:space="preserve">19 nov</w:t>
             </w:r>
           </w:p>
         </w:tc>
@@ -11963,7 +11963,7 @@
                 <w:sz w:val="17"/>
                 <w:szCs w:val="17"/>
               </w:rPr>
-              <w:t xml:space="preserve">19 nov</w:t>
+              <w:t xml:space="preserve">26 nov</w:t>
             </w:r>
           </w:p>
         </w:tc>
@@ -12078,7 +12078,7 @@
                 <w:sz w:val="17"/>
                 <w:szCs w:val="17"/>
               </w:rPr>
-              <w:t xml:space="preserve">26 nov</w:t>
+              <w:t xml:space="preserve">3 dic</w:t>
             </w:r>
           </w:p>
         </w:tc>
@@ -12193,7 +12193,7 @@
                 <w:sz w:val="17"/>
                 <w:szCs w:val="17"/>
               </w:rPr>
-              <w:t xml:space="preserve">3 dic</w:t>
+              <w:t xml:space="preserve">10 dic</w:t>
             </w:r>
           </w:p>
         </w:tc>
@@ -12461,7 +12461,7 @@
                 <w:sz w:val="18"/>
                 <w:szCs w:val="18"/>
               </w:rPr>
-              <w:t xml:space="preserve">Jueves 21:00–22:00, hora de Chile (15 oct → 3 dic) · con Jay Kim (김재희).</w:t>
+              <w:t xml:space="preserve">Jueves 21:00–22:00, hora de Chile (22 oct → 10 dic) · con Jay Kim (김재희).</w:t>
             </w:r>
           </w:p>
         </w:tc>
@@ -12532,7 +12532,7 @@
                 <w:sz w:val="18"/>
                 <w:szCs w:val="18"/>
               </w:rPr>
-              <w:t xml:space="preserve"> (la 2.ª antes de la clase 5: jueves 12 de noviembre). La inscripción al examen oficial se paga aparte.</w:t>
+              <w:t xml:space="preserve"> (la 2.ª antes de la clase 5: jueves 19 de noviembre). La inscripción al examen oficial se paga aparte.</w:t>
             </w:r>
           </w:p>
         </w:tc>
@@ -14236,7 +14236,7 @@
                 <w:sz w:val="18"/>
                 <w:szCs w:val="18"/>
               </w:rPr>
-              <w:t xml:space="preserve">Lunes 18:00–19:00, hora de Chile (19 oct → 7 dic; el 12 de octubre es feriado en Chile) · con Jay Kim (김재희) y Abby (홍미영).</w:t>
+              <w:t xml:space="preserve">Lunes 18:00–19:00, hora de Chile (19 oct → 7 dic) · con Jay Kim (김재희) y Abby (홍미영).</w:t>
             </w:r>
           </w:p>
         </w:tc>
@@ -15636,7 +15636,7 @@
           <w:sz w:val="19"/>
           <w:szCs w:val="19"/>
         </w:rPr>
-        <w:t xml:space="preserve">Al completar tu curso recibes el certificado digital de Academia Seúl del nivel cursado, que considera tu asistencia y tu participación. Se entregan la semana del 7 de diciembre (en Niños, durante el mini-show del lunes 7). Es un certificado propio de la academia: no es una acreditación oficial, no lo emite el gobierno de Corea ni una universidad y no reemplaza al examen TOPIK.</w:t>
+        <w:t xml:space="preserve">Al completar tu curso recibes el certificado digital de Academia Seúl del nivel cursado, que considera tu asistencia y tu participación. Se entregan la semana del 14 de diciembre (en Niños, durante el mini-show del lunes 7 de diciembre). Es un certificado propio de la academia: no es una acreditación oficial, no lo emite el gobierno de Corea ni una universidad y no reemplaza al examen TOPIK.</w:t>
       </w:r>
     </w:p>
     <w:p>
@@ -16418,7 +16418,7 @@
                 <w:sz w:val="22"/>
                 <w:szCs w:val="22"/>
               </w:rPr>
-              <w:t xml:space="preserve">La matrícula cierra el domingo 11 de octubre</w:t>
+              <w:t xml:space="preserve">La matrícula cierra el domingo 18 de octubre</w:t>
             </w:r>
             <w:r>
               <w:rPr>
@@ -16427,7 +16427,7 @@
                 <w:sz w:val="21"/>
                 <w:szCs w:val="21"/>
               </w:rPr>
-              <w:t xml:space="preserve">, o antes si se completan los cupos. Las clases de adultos parten la semana del 12 de octubre y Coreano para Niños, el lunes 19.</w:t>
+              <w:t xml:space="preserve">, o antes si se completan los cupos. Todas las clases parten la semana del 19 de octubre (Coreano para Niños, el lunes 19).</w:t>
             </w:r>
           </w:p>
         </w:tc>

</xml_diff>